<commit_message>
docs: upgrade README with professional layout, add day4 & day5, learning roadmap, GitHub stats, and important links
</commit_message>
<xml_diff>
--- a/day3/Lab/Day2_Lab Assignment_v2.docx
+++ b/day3/Lab/Day2_Lab Assignment_v2.docx
@@ -1,6 +1,6 @@
 
 <file path=word/document.xml><?xml version="1.0" encoding="utf-8"?>
-<w:document xmlns:wpc="http://schemas.microsoft.com/office/word/2010/wordprocessingCanvas" xmlns:cx="http://schemas.microsoft.com/office/drawing/2014/chartex" xmlns:cx1="http://schemas.microsoft.com/office/drawing/2015/9/8/chartex" xmlns:cx2="http://schemas.microsoft.com/office/drawing/2015/10/21/chartex" xmlns:cx3="http://schemas.microsoft.com/office/drawing/2016/5/9/chartex" xmlns:cx4="http://schemas.microsoft.com/office/drawing/2016/5/10/chartex" xmlns:cx5="http://schemas.microsoft.com/office/drawing/2016/5/11/chartex" xmlns:cx6="http://schemas.microsoft.com/office/drawing/2016/5/12/chartex" xmlns:cx7="http://schemas.microsoft.com/office/drawing/2016/5/13/chartex" xmlns:cx8="http://schemas.microsoft.com/office/drawing/2016/5/14/chartex" xmlns:mc="http://schemas.openxmlformats.org/markup-compatibility/2006" xmlns:aink="http://schemas.microsoft.com/office/drawing/2016/ink" xmlns:am3d="http://schemas.microsoft.com/office/drawing/2017/model3d" xmlns:o="urn:schemas-microsoft-com:office:office" xmlns:oel="http://schemas.microsoft.com/office/2019/extlst" xmlns:r="http://schemas.openxmlformats.org/officeDocument/2006/relationships" xmlns:m="http://schemas.openxmlformats.org/officeDocument/2006/math" xmlns:v="urn:schemas-microsoft-com:vml" xmlns:wp14="http://schemas.microsoft.com/office/word/2010/wordprocessingDrawing" xmlns:wp="http://schemas.openxmlformats.org/drawingml/2006/wordprocessingDrawing" xmlns:w10="urn:schemas-microsoft-com:office:word" xmlns:w="http://schemas.openxmlformats.org/wordprocessingml/2006/main" xmlns:w14="http://schemas.microsoft.com/office/word/2010/wordml" xmlns:w15="http://schemas.microsoft.com/office/word/2012/wordml" xmlns:w16cex="http://schemas.microsoft.com/office/word/2018/wordml/cex" xmlns:w16cid="http://schemas.microsoft.com/office/word/2016/wordml/cid" xmlns:w16="http://schemas.microsoft.com/office/word/2018/wordml" xmlns:w16du="http://schemas.microsoft.com/office/word/2023/wordml/word16du" xmlns:w16sdtdh="http://schemas.microsoft.com/office/word/2020/wordml/sdtdatahash" xmlns:w16sdtfl="http://schemas.microsoft.com/office/word/2024/wordml/sdtformatlock" xmlns:w16se="http://schemas.microsoft.com/office/word/2015/wordml/symex" xmlns:wpg="http://schemas.microsoft.com/office/word/2010/wordprocessingGroup" xmlns:wpi="http://schemas.microsoft.com/office/word/2010/wordprocessingInk" xmlns:wne="http://schemas.microsoft.com/office/word/2006/wordml" xmlns:wps="http://schemas.microsoft.com/office/word/2010/wordprocessingShape" mc:Ignorable="w14 w15 w16se w16cid w16 w16cex w16sdtdh w16sdtfl w16du wp14">
+<w:document xmlns:wpc="http://schemas.microsoft.com/office/word/2010/wordprocessingCanvas" xmlns:cx="http://schemas.microsoft.com/office/drawing/2014/chartex" xmlns:cx1="http://schemas.microsoft.com/office/drawing/2015/9/8/chartex" xmlns:cx2="http://schemas.microsoft.com/office/drawing/2015/10/21/chartex" xmlns:cx3="http://schemas.microsoft.com/office/drawing/2016/5/9/chartex" xmlns:cx4="http://schemas.microsoft.com/office/drawing/2016/5/10/chartex" xmlns:cx5="http://schemas.microsoft.com/office/drawing/2016/5/11/chartex" xmlns:cx6="http://schemas.microsoft.com/office/drawing/2016/5/12/chartex" xmlns:cx7="http://schemas.microsoft.com/office/drawing/2016/5/13/chartex" xmlns:cx8="http://schemas.microsoft.com/office/drawing/2016/5/14/chartex" xmlns:mc="http://schemas.openxmlformats.org/markup-compatibility/2006" xmlns:aink="http://schemas.microsoft.com/office/drawing/2016/ink" xmlns:am3d="http://schemas.microsoft.com/office/drawing/2017/model3d" xmlns:o="urn:schemas-microsoft-com:office:office" xmlns:oel="http://schemas.microsoft.com/office/2019/extlst" xmlns:r="http://schemas.openxmlformats.org/officeDocument/2006/relationships" xmlns:m="http://schemas.openxmlformats.org/officeDocument/2006/math" xmlns:v="urn:schemas-microsoft-com:vml" xmlns:wp14="http://schemas.microsoft.com/office/word/2010/wordprocessingDrawing" xmlns:wp="http://schemas.openxmlformats.org/drawingml/2006/wordprocessingDrawing" xmlns:w10="urn:schemas-microsoft-com:office:word" xmlns:w="http://schemas.openxmlformats.org/wordprocessingml/2006/main" xmlns:w14="http://schemas.microsoft.com/office/word/2010/wordml" xmlns:w15="http://schemas.microsoft.com/office/word/2012/wordml" xmlns:w16cei="http://schemas.microsoft.com/office/word/2026/wordml/cei" xmlns:w16cex="http://schemas.microsoft.com/office/word/2018/wordml/cex" xmlns:w16cid="http://schemas.microsoft.com/office/word/2016/wordml/cid" xmlns:w16="http://schemas.microsoft.com/office/word/2018/wordml" xmlns:w16du="http://schemas.microsoft.com/office/word/2023/wordml/word16du" xmlns:w16sdtdh="http://schemas.microsoft.com/office/word/2020/wordml/sdtdatahash" xmlns:w16sdtfl="http://schemas.microsoft.com/office/word/2024/wordml/sdtformatlock" xmlns:w16se="http://schemas.microsoft.com/office/word/2015/wordml/symex" xmlns:wpg="http://schemas.microsoft.com/office/word/2010/wordprocessingGroup" xmlns:wpi="http://schemas.microsoft.com/office/word/2010/wordprocessingInk" xmlns:wne="http://schemas.microsoft.com/office/word/2006/wordml" xmlns:wps="http://schemas.microsoft.com/office/word/2010/wordprocessingShape" mc:Ignorable="w14 w15 w16se w16cid w16 w16cex w16sdtdh w16sdtfl w16du wp14">
   <w:body>
     <w:p>
       <w:pPr>
@@ -39,12 +39,6 @@
                     <w:gridCol w:w="2125"/>
                   </w:tblGrid>
                   <w:tr>
-                    <w:tblPrEx>
-                      <w:tblCellMar>
-                        <w:top w:w="0" w:type="dxa"/>
-                        <w:bottom w:w="0" w:type="dxa"/>
-                      </w:tblCellMar>
-                    </w:tblPrEx>
                     <w:tc>
                       <w:tcPr>
                         <w:tcW w:w="8679" w:type="dxa"/>
@@ -132,12 +126,6 @@
                     </w:tc>
                   </w:tr>
                   <w:tr>
-                    <w:tblPrEx>
-                      <w:tblCellMar>
-                        <w:top w:w="0" w:type="dxa"/>
-                        <w:bottom w:w="0" w:type="dxa"/>
-                      </w:tblCellMar>
-                    </w:tblPrEx>
                     <w:tc>
                       <w:tcPr>
                         <w:tcW w:w="8679" w:type="dxa"/>
@@ -290,12 +278,6 @@
                     </w:tc>
                   </w:tr>
                   <w:tr>
-                    <w:tblPrEx>
-                      <w:tblCellMar>
-                        <w:top w:w="0" w:type="dxa"/>
-                        <w:bottom w:w="0" w:type="dxa"/>
-                      </w:tblCellMar>
-                    </w:tblPrEx>
                     <w:tc>
                       <w:tcPr>
                         <w:tcW w:w="1919" w:type="dxa"/>
@@ -957,18 +939,12 @@
                     </w:tc>
                     <w:tc>
                       <w:tcPr>
-                        <w:tcW w:w="2124" w:type="dxa"/>
+                        <w:tcW w:w="2125" w:type="dxa"/>
                       </w:tcPr>
                       <w:p/>
                     </w:tc>
                   </w:tr>
                   <w:tr>
-                    <w:tblPrEx>
-                      <w:tblCellMar>
-                        <w:top w:w="0" w:type="dxa"/>
-                        <w:bottom w:w="0" w:type="dxa"/>
-                      </w:tblCellMar>
-                    </w:tblPrEx>
                     <w:tc>
                       <w:tcPr>
                         <w:tcW w:w="1919" w:type="dxa"/>
@@ -994,7 +970,7 @@
                     </w:tc>
                     <w:tc>
                       <w:tcPr>
-                        <w:tcW w:w="2124" w:type="dxa"/>
+                        <w:tcW w:w="2125" w:type="dxa"/>
                         <w:tcBorders>
                           <w:top w:val="single" w:sz="8" w:space="0" w:color="BFBFBF"/>
                           <w:left w:val="single" w:sz="8" w:space="0" w:color="BFBFBF"/>
@@ -1007,12 +983,6 @@
                     </w:tc>
                   </w:tr>
                   <w:tr>
-                    <w:tblPrEx>
-                      <w:tblCellMar>
-                        <w:top w:w="0" w:type="dxa"/>
-                        <w:bottom w:w="0" w:type="dxa"/>
-                      </w:tblCellMar>
-                    </w:tblPrEx>
                     <w:trPr>
                       <w:trHeight w:val="499"/>
                     </w:trPr>
@@ -1041,7 +1011,7 @@
                     </w:tc>
                     <w:tc>
                       <w:tcPr>
-                        <w:tcW w:w="2124" w:type="dxa"/>
+                        <w:tcW w:w="2125" w:type="dxa"/>
                         <w:vMerge w:val="restart"/>
                         <w:tcBorders>
                           <w:top w:val="single" w:sz="8" w:space="0" w:color="BFBFBF"/>
@@ -1072,12 +1042,6 @@
                     </w:tc>
                   </w:tr>
                   <w:tr>
-                    <w:tblPrEx>
-                      <w:tblCellMar>
-                        <w:top w:w="0" w:type="dxa"/>
-                        <w:bottom w:w="0" w:type="dxa"/>
-                      </w:tblCellMar>
-                    </w:tblPrEx>
                     <w:trPr>
                       <w:trHeight w:val="499"/>
                     </w:trPr>
@@ -1106,7 +1070,7 @@
                     </w:tc>
                     <w:tc>
                       <w:tcPr>
-                        <w:tcW w:w="2124" w:type="dxa"/>
+                        <w:tcW w:w="2125" w:type="dxa"/>
                         <w:vMerge/>
                         <w:tcBorders>
                           <w:left w:val="single" w:sz="8" w:space="0" w:color="BFBFBF"/>
@@ -1117,12 +1081,6 @@
                     </w:tc>
                   </w:tr>
                   <w:tr>
-                    <w:tblPrEx>
-                      <w:tblCellMar>
-                        <w:top w:w="0" w:type="dxa"/>
-                        <w:bottom w:w="0" w:type="dxa"/>
-                      </w:tblCellMar>
-                    </w:tblPrEx>
                     <w:tc>
                       <w:tcPr>
                         <w:tcW w:w="1919" w:type="dxa"/>
@@ -1149,7 +1107,7 @@
                     </w:tc>
                     <w:tc>
                       <w:tcPr>
-                        <w:tcW w:w="2124" w:type="dxa"/>
+                        <w:tcW w:w="2125" w:type="dxa"/>
                         <w:vMerge/>
                         <w:tcBorders>
                           <w:left w:val="single" w:sz="8" w:space="0" w:color="BFBFBF"/>
@@ -1160,12 +1118,6 @@
                     </w:tc>
                   </w:tr>
                   <w:tr>
-                    <w:tblPrEx>
-                      <w:tblCellMar>
-                        <w:top w:w="0" w:type="dxa"/>
-                        <w:bottom w:w="0" w:type="dxa"/>
-                      </w:tblCellMar>
-                    </w:tblPrEx>
                     <w:tc>
                       <w:tcPr>
                         <w:tcW w:w="8679" w:type="dxa"/>
@@ -1348,12 +1300,6 @@
                     <w:gridCol w:w="7075"/>
                   </w:tblGrid>
                   <w:tr>
-                    <w:tblPrEx>
-                      <w:tblCellMar>
-                        <w:top w:w="0" w:type="dxa"/>
-                        <w:bottom w:w="0" w:type="dxa"/>
-                      </w:tblCellMar>
-                    </w:tblPrEx>
                     <w:trPr>
                       <w:trHeight w:hRule="exact" w:val="1552"/>
                     </w:trPr>
@@ -1677,12 +1623,6 @@
                     <w:gridCol w:w="7932"/>
                   </w:tblGrid>
                   <w:tr>
-                    <w:tblPrEx>
-                      <w:tblCellMar>
-                        <w:top w:w="0" w:type="dxa"/>
-                        <w:bottom w:w="0" w:type="dxa"/>
-                      </w:tblCellMar>
-                    </w:tblPrEx>
                     <w:trPr>
                       <w:trHeight w:hRule="exact" w:val="1982"/>
                     </w:trPr>
@@ -1731,12 +1671,6 @@
                     <w:gridCol w:w="2460"/>
                   </w:tblGrid>
                   <w:tr>
-                    <w:tblPrEx>
-                      <w:tblCellMar>
-                        <w:top w:w="0" w:type="dxa"/>
-                        <w:bottom w:w="0" w:type="dxa"/>
-                      </w:tblCellMar>
-                    </w:tblPrEx>
                     <w:trPr>
                       <w:trHeight w:hRule="exact" w:val="270"/>
                     </w:trPr>
@@ -1831,12 +1765,6 @@
                     <w:gridCol w:w="275"/>
                   </w:tblGrid>
                   <w:tr>
-                    <w:tblPrEx>
-                      <w:tblCellMar>
-                        <w:top w:w="0" w:type="dxa"/>
-                        <w:bottom w:w="0" w:type="dxa"/>
-                      </w:tblCellMar>
-                    </w:tblPrEx>
                     <w:trPr>
                       <w:trHeight w:hRule="exact" w:val="1693"/>
                     </w:trPr>
@@ -1884,12 +1812,6 @@
                     <w:gridCol w:w="7902"/>
                   </w:tblGrid>
                   <w:tr>
-                    <w:tblPrEx>
-                      <w:tblCellMar>
-                        <w:top w:w="0" w:type="dxa"/>
-                        <w:bottom w:w="0" w:type="dxa"/>
-                      </w:tblCellMar>
-                    </w:tblPrEx>
                     <w:trPr>
                       <w:trHeight w:hRule="exact" w:val="1756"/>
                     </w:trPr>
@@ -2254,12 +2176,6 @@
                     <w:gridCol w:w="6325"/>
                   </w:tblGrid>
                   <w:tr>
-                    <w:tblPrEx>
-                      <w:tblCellMar>
-                        <w:top w:w="0" w:type="dxa"/>
-                        <w:bottom w:w="0" w:type="dxa"/>
-                      </w:tblCellMar>
-                    </w:tblPrEx>
                     <w:trPr>
                       <w:trHeight w:hRule="exact" w:val="433"/>
                     </w:trPr>
@@ -2351,7 +2267,7 @@
 </file>
 
 <file path=word/endnotes.xml><?xml version="1.0" encoding="utf-8"?>
-<w:endnotes xmlns:wpc="http://schemas.microsoft.com/office/word/2010/wordprocessingCanvas" xmlns:cx="http://schemas.microsoft.com/office/drawing/2014/chartex" xmlns:cx1="http://schemas.microsoft.com/office/drawing/2015/9/8/chartex" xmlns:cx2="http://schemas.microsoft.com/office/drawing/2015/10/21/chartex" xmlns:cx3="http://schemas.microsoft.com/office/drawing/2016/5/9/chartex" xmlns:cx4="http://schemas.microsoft.com/office/drawing/2016/5/10/chartex" xmlns:cx5="http://schemas.microsoft.com/office/drawing/2016/5/11/chartex" xmlns:cx6="http://schemas.microsoft.com/office/drawing/2016/5/12/chartex" xmlns:cx7="http://schemas.microsoft.com/office/drawing/2016/5/13/chartex" xmlns:cx8="http://schemas.microsoft.com/office/drawing/2016/5/14/chartex" xmlns:mc="http://schemas.openxmlformats.org/markup-compatibility/2006" xmlns:aink="http://schemas.microsoft.com/office/drawing/2016/ink" xmlns:am3d="http://schemas.microsoft.com/office/drawing/2017/model3d" xmlns:o="urn:schemas-microsoft-com:office:office" xmlns:oel="http://schemas.microsoft.com/office/2019/extlst" xmlns:r="http://schemas.openxmlformats.org/officeDocument/2006/relationships" xmlns:m="http://schemas.openxmlformats.org/officeDocument/2006/math" xmlns:v="urn:schemas-microsoft-com:vml" xmlns:wp14="http://schemas.microsoft.com/office/word/2010/wordprocessingDrawing" xmlns:wp="http://schemas.openxmlformats.org/drawingml/2006/wordprocessingDrawing" xmlns:w10="urn:schemas-microsoft-com:office:word" xmlns:w="http://schemas.openxmlformats.org/wordprocessingml/2006/main" xmlns:w14="http://schemas.microsoft.com/office/word/2010/wordml" xmlns:w15="http://schemas.microsoft.com/office/word/2012/wordml" xmlns:w16cex="http://schemas.microsoft.com/office/word/2018/wordml/cex" xmlns:w16cid="http://schemas.microsoft.com/office/word/2016/wordml/cid" xmlns:w16="http://schemas.microsoft.com/office/word/2018/wordml" xmlns:w16du="http://schemas.microsoft.com/office/word/2023/wordml/word16du" xmlns:w16sdtdh="http://schemas.microsoft.com/office/word/2020/wordml/sdtdatahash" xmlns:w16sdtfl="http://schemas.microsoft.com/office/word/2024/wordml/sdtformatlock" xmlns:w16se="http://schemas.microsoft.com/office/word/2015/wordml/symex" xmlns:wpg="http://schemas.microsoft.com/office/word/2010/wordprocessingGroup" xmlns:wpi="http://schemas.microsoft.com/office/word/2010/wordprocessingInk" xmlns:wne="http://schemas.microsoft.com/office/word/2006/wordml" xmlns:wps="http://schemas.microsoft.com/office/word/2010/wordprocessingShape" mc:Ignorable="w14 w15 w16se w16cid w16 w16cex w16sdtdh w16sdtfl w16du wp14">
+<w:endnotes xmlns:wpc="http://schemas.microsoft.com/office/word/2010/wordprocessingCanvas" xmlns:cx="http://schemas.microsoft.com/office/drawing/2014/chartex" xmlns:cx1="http://schemas.microsoft.com/office/drawing/2015/9/8/chartex" xmlns:cx2="http://schemas.microsoft.com/office/drawing/2015/10/21/chartex" xmlns:cx3="http://schemas.microsoft.com/office/drawing/2016/5/9/chartex" xmlns:cx4="http://schemas.microsoft.com/office/drawing/2016/5/10/chartex" xmlns:cx5="http://schemas.microsoft.com/office/drawing/2016/5/11/chartex" xmlns:cx6="http://schemas.microsoft.com/office/drawing/2016/5/12/chartex" xmlns:cx7="http://schemas.microsoft.com/office/drawing/2016/5/13/chartex" xmlns:cx8="http://schemas.microsoft.com/office/drawing/2016/5/14/chartex" xmlns:mc="http://schemas.openxmlformats.org/markup-compatibility/2006" xmlns:aink="http://schemas.microsoft.com/office/drawing/2016/ink" xmlns:am3d="http://schemas.microsoft.com/office/drawing/2017/model3d" xmlns:o="urn:schemas-microsoft-com:office:office" xmlns:oel="http://schemas.microsoft.com/office/2019/extlst" xmlns:r="http://schemas.openxmlformats.org/officeDocument/2006/relationships" xmlns:m="http://schemas.openxmlformats.org/officeDocument/2006/math" xmlns:v="urn:schemas-microsoft-com:vml" xmlns:wp14="http://schemas.microsoft.com/office/word/2010/wordprocessingDrawing" xmlns:wp="http://schemas.openxmlformats.org/drawingml/2006/wordprocessingDrawing" xmlns:w10="urn:schemas-microsoft-com:office:word" xmlns:w="http://schemas.openxmlformats.org/wordprocessingml/2006/main" xmlns:w14="http://schemas.microsoft.com/office/word/2010/wordml" xmlns:w15="http://schemas.microsoft.com/office/word/2012/wordml" xmlns:w16cei="http://schemas.microsoft.com/office/word/2026/wordml/cei" xmlns:w16cex="http://schemas.microsoft.com/office/word/2018/wordml/cex" xmlns:w16cid="http://schemas.microsoft.com/office/word/2016/wordml/cid" xmlns:w16="http://schemas.microsoft.com/office/word/2018/wordml" xmlns:w16du="http://schemas.microsoft.com/office/word/2023/wordml/word16du" xmlns:w16sdtdh="http://schemas.microsoft.com/office/word/2020/wordml/sdtdatahash" xmlns:w16sdtfl="http://schemas.microsoft.com/office/word/2024/wordml/sdtformatlock" xmlns:w16se="http://schemas.microsoft.com/office/word/2015/wordml/symex" xmlns:wpg="http://schemas.microsoft.com/office/word/2010/wordprocessingGroup" xmlns:wpi="http://schemas.microsoft.com/office/word/2010/wordprocessingInk" xmlns:wne="http://schemas.microsoft.com/office/word/2006/wordml" xmlns:wps="http://schemas.microsoft.com/office/word/2010/wordprocessingShape" mc:Ignorable="w14 w15 w16se w16cid w16 w16cex w16sdtdh w16sdtfl w16du wp14">
   <w:endnote w:type="separator" w:id="-1">
     <w:p>
       <w:r>
@@ -2370,7 +2286,7 @@
 </file>
 
 <file path=word/footnotes.xml><?xml version="1.0" encoding="utf-8"?>
-<w:footnotes xmlns:wpc="http://schemas.microsoft.com/office/word/2010/wordprocessingCanvas" xmlns:cx="http://schemas.microsoft.com/office/drawing/2014/chartex" xmlns:cx1="http://schemas.microsoft.com/office/drawing/2015/9/8/chartex" xmlns:cx2="http://schemas.microsoft.com/office/drawing/2015/10/21/chartex" xmlns:cx3="http://schemas.microsoft.com/office/drawing/2016/5/9/chartex" xmlns:cx4="http://schemas.microsoft.com/office/drawing/2016/5/10/chartex" xmlns:cx5="http://schemas.microsoft.com/office/drawing/2016/5/11/chartex" xmlns:cx6="http://schemas.microsoft.com/office/drawing/2016/5/12/chartex" xmlns:cx7="http://schemas.microsoft.com/office/drawing/2016/5/13/chartex" xmlns:cx8="http://schemas.microsoft.com/office/drawing/2016/5/14/chartex" xmlns:mc="http://schemas.openxmlformats.org/markup-compatibility/2006" xmlns:aink="http://schemas.microsoft.com/office/drawing/2016/ink" xmlns:am3d="http://schemas.microsoft.com/office/drawing/2017/model3d" xmlns:o="urn:schemas-microsoft-com:office:office" xmlns:oel="http://schemas.microsoft.com/office/2019/extlst" xmlns:r="http://schemas.openxmlformats.org/officeDocument/2006/relationships" xmlns:m="http://schemas.openxmlformats.org/officeDocument/2006/math" xmlns:v="urn:schemas-microsoft-com:vml" xmlns:wp14="http://schemas.microsoft.com/office/word/2010/wordprocessingDrawing" xmlns:wp="http://schemas.openxmlformats.org/drawingml/2006/wordprocessingDrawing" xmlns:w10="urn:schemas-microsoft-com:office:word" xmlns:w="http://schemas.openxmlformats.org/wordprocessingml/2006/main" xmlns:w14="http://schemas.microsoft.com/office/word/2010/wordml" xmlns:w15="http://schemas.microsoft.com/office/word/2012/wordml" xmlns:w16cex="http://schemas.microsoft.com/office/word/2018/wordml/cex" xmlns:w16cid="http://schemas.microsoft.com/office/word/2016/wordml/cid" xmlns:w16="http://schemas.microsoft.com/office/word/2018/wordml" xmlns:w16du="http://schemas.microsoft.com/office/word/2023/wordml/word16du" xmlns:w16sdtdh="http://schemas.microsoft.com/office/word/2020/wordml/sdtdatahash" xmlns:w16sdtfl="http://schemas.microsoft.com/office/word/2024/wordml/sdtformatlock" xmlns:w16se="http://schemas.microsoft.com/office/word/2015/wordml/symex" xmlns:wpg="http://schemas.microsoft.com/office/word/2010/wordprocessingGroup" xmlns:wpi="http://schemas.microsoft.com/office/word/2010/wordprocessingInk" xmlns:wne="http://schemas.microsoft.com/office/word/2006/wordml" xmlns:wps="http://schemas.microsoft.com/office/word/2010/wordprocessingShape" mc:Ignorable="w14 w15 w16se w16cid w16 w16cex w16sdtdh w16sdtfl w16du wp14">
+<w:footnotes xmlns:wpc="http://schemas.microsoft.com/office/word/2010/wordprocessingCanvas" xmlns:cx="http://schemas.microsoft.com/office/drawing/2014/chartex" xmlns:cx1="http://schemas.microsoft.com/office/drawing/2015/9/8/chartex" xmlns:cx2="http://schemas.microsoft.com/office/drawing/2015/10/21/chartex" xmlns:cx3="http://schemas.microsoft.com/office/drawing/2016/5/9/chartex" xmlns:cx4="http://schemas.microsoft.com/office/drawing/2016/5/10/chartex" xmlns:cx5="http://schemas.microsoft.com/office/drawing/2016/5/11/chartex" xmlns:cx6="http://schemas.microsoft.com/office/drawing/2016/5/12/chartex" xmlns:cx7="http://schemas.microsoft.com/office/drawing/2016/5/13/chartex" xmlns:cx8="http://schemas.microsoft.com/office/drawing/2016/5/14/chartex" xmlns:mc="http://schemas.openxmlformats.org/markup-compatibility/2006" xmlns:aink="http://schemas.microsoft.com/office/drawing/2016/ink" xmlns:am3d="http://schemas.microsoft.com/office/drawing/2017/model3d" xmlns:o="urn:schemas-microsoft-com:office:office" xmlns:oel="http://schemas.microsoft.com/office/2019/extlst" xmlns:r="http://schemas.openxmlformats.org/officeDocument/2006/relationships" xmlns:m="http://schemas.openxmlformats.org/officeDocument/2006/math" xmlns:v="urn:schemas-microsoft-com:vml" xmlns:wp14="http://schemas.microsoft.com/office/word/2010/wordprocessingDrawing" xmlns:wp="http://schemas.openxmlformats.org/drawingml/2006/wordprocessingDrawing" xmlns:w10="urn:schemas-microsoft-com:office:word" xmlns:w="http://schemas.openxmlformats.org/wordprocessingml/2006/main" xmlns:w14="http://schemas.microsoft.com/office/word/2010/wordml" xmlns:w15="http://schemas.microsoft.com/office/word/2012/wordml" xmlns:w16cei="http://schemas.microsoft.com/office/word/2026/wordml/cei" xmlns:w16cex="http://schemas.microsoft.com/office/word/2018/wordml/cex" xmlns:w16cid="http://schemas.microsoft.com/office/word/2016/wordml/cid" xmlns:w16="http://schemas.microsoft.com/office/word/2018/wordml" xmlns:w16du="http://schemas.microsoft.com/office/word/2023/wordml/word16du" xmlns:w16sdtdh="http://schemas.microsoft.com/office/word/2020/wordml/sdtdatahash" xmlns:w16sdtfl="http://schemas.microsoft.com/office/word/2024/wordml/sdtformatlock" xmlns:w16se="http://schemas.microsoft.com/office/word/2015/wordml/symex" xmlns:wpg="http://schemas.microsoft.com/office/word/2010/wordprocessingGroup" xmlns:wpi="http://schemas.microsoft.com/office/word/2010/wordprocessingInk" xmlns:wne="http://schemas.microsoft.com/office/word/2006/wordml" xmlns:wps="http://schemas.microsoft.com/office/word/2010/wordprocessingShape" mc:Ignorable="w14 w15 w16se w16cid w16 w16cex w16sdtdh w16sdtfl w16du wp14">
   <w:footnote w:type="separator" w:id="-1">
     <w:p>
       <w:r>

</xml_diff>